<commit_message>
Titel fuehren mit der digitalen Fragestellung, nicht mit dem klinischen Anlassfall
</commit_message>
<xml_diff>
--- a/download/studien-aktuell.docx
+++ b/download/studien-aktuell.docx
@@ -78,7 +78,7 @@
         <w:pStyle w:val="Heading2"/>
       </w:pPr>
       <w:r>
-        <w:t>Föderiertes Lernen über fünf Intensivdatenbanken: Vorhersage der erfolgreichen Beatmungsentwöhnung</w:t>
+        <w:t>KI-Training über fünf Kliniken hinweg, ohne Patientendaten zu teilen: was der Datenschutz an Genauigkeit kostet</w:t>
       </w:r>
     </w:p>
     <w:p>
@@ -93,7 +93,7 @@
     </w:p>
     <w:p>
       <w:r>
-        <w:t>Retrospektiver Vergleich dreier Lernverfahren an 24.521 Intensivpatienten aus fünf Datenbanken (darunter das Universitätsklinikum Augsburg), überführt in das OMOP-Datenmodell.</w:t>
+        <w:t>Vergleich dreier Trainingsverfahren an 24.521 Intensivpatienten aus fünf Datenbanken, darunter das Universitätsklinikum Augsburg, alle überführt in das OMOP-Datenmodell — die Frage ist nicht die Beatmung, sondern ob föderiertes Lernen das Zusammenlegen von Behandlungsdaten ersetzen kann.</w:t>
       </w:r>
     </w:p>
     <w:p>
@@ -104,7 +104,7 @@
         <w:t xml:space="preserve">Ergebnis: </w:t>
       </w:r>
       <w:r>
-        <w:t>Zentrales Training auf zusammengelegten Daten erreichte AUROC 0,81, föderiertes Lernen ohne Weitergabe von Patientendaten 0,74, rein lokales Training je nach Haus 0,68 bis 0,84. Der Preis des Datenschutzes ist damit beziffert: rund sieben AUROC-Punkte gegenüber der Poollösung — und lokal starke Häuser verlieren durch Föderation sogar.</w:t>
+        <w:t>Zentrales Training auf zusammengelegten Daten erreichte AUROC 0,81, föderiertes Lernen ohne Weitergabe von Patientendaten 0,74, rein lokales Training je nach Haus 0,68 bis 0,84. Der Abstand ist damit beziffert: rund sieben AUROC-Punkte — und Häuser mit guter eigener Datenlage verlieren durch die Föderation sogar. Die Autoren betonen, dass sie den Datenschutzgewinn nicht gemessen haben; die Zahlen sind ein Leistungsvergleich, keine Abwägung.</w:t>
       </w:r>
     </w:p>
     <w:p>
@@ -119,7 +119,7 @@
         <w:rPr>
           <w:sz w:val="19"/>
         </w:rPr>
-        <w:t>Deutsche Klinikdaten im OMOP-Modell, direkt auf MII-Strukturen übertragbar</w:t>
+        <w:t>Deutsche und Schweizer Intensivdaten im OMOP-Modell, MII-Strukturen vergleichbar</w:t>
       </w:r>
     </w:p>
     <w:p>

</xml_diff>